<commit_message>
Continue the attacktive directory thm ctf and upload it to github
</commit_message>
<xml_diff>
--- a/THM_challenges/Medium/Attacktive Directory/Attacktive_Directory_Solution_Documentation.docx
+++ b/THM_challenges/Medium/Attacktive Directory/Attacktive_Directory_Solution_Documentation.docx
@@ -13,6 +13,7 @@
           <w:u w:val="single"/>
         </w:rPr>
       </w:pPr>
+      <w:proofErr w:type="spellStart"/>
       <w:r>
         <w:rPr>
           <w:b/>
@@ -23,6 +24,7 @@
         </w:rPr>
         <w:t>Attacktive_Directory_Solution_Documentation</w:t>
       </w:r>
+      <w:proofErr w:type="spellEnd"/>
     </w:p>
     <w:p>
       <w:pPr>
@@ -61,6 +63,9 @@
     </w:p>
     <w:p>
       <w:r>
+        <w:rPr>
+          <w:noProof/>
+        </w:rPr>
         <w:drawing>
           <wp:inline distT="0" distB="0" distL="0" distR="0" wp14:anchorId="1D133861" wp14:editId="3EC92C6D">
             <wp:extent cx="4635500" cy="3687217"/>
@@ -113,6 +118,9 @@
     </w:p>
     <w:p>
       <w:r>
+        <w:rPr>
+          <w:noProof/>
+        </w:rPr>
         <w:drawing>
           <wp:inline distT="0" distB="0" distL="0" distR="0" wp14:anchorId="5782C965" wp14:editId="6FB7E1E7">
             <wp:extent cx="3193274" cy="723900"/>
@@ -166,6 +174,9 @@
     </w:p>
     <w:p>
       <w:r>
+        <w:rPr>
+          <w:noProof/>
+        </w:rPr>
         <w:drawing>
           <wp:inline distT="0" distB="0" distL="0" distR="0" wp14:anchorId="74E6E13D" wp14:editId="573DA5FA">
             <wp:extent cx="5932684" cy="903048"/>
@@ -239,6 +250,9 @@
     </w:p>
     <w:p>
       <w:r>
+        <w:rPr>
+          <w:noProof/>
+        </w:rPr>
         <w:drawing>
           <wp:inline distT="0" distB="0" distL="0" distR="0" wp14:anchorId="754BB147" wp14:editId="59EAFDBB">
             <wp:extent cx="5033433" cy="2089349"/>
@@ -289,6 +303,9 @@
     </w:p>
     <w:p>
       <w:r>
+        <w:rPr>
+          <w:noProof/>
+        </w:rPr>
         <w:drawing>
           <wp:inline distT="0" distB="0" distL="0" distR="0" wp14:anchorId="449D1560" wp14:editId="5949D373">
             <wp:extent cx="4503810" cy="3105419"/>
@@ -326,6 +343,7 @@
         </w:drawing>
       </w:r>
     </w:p>
+    <w:p/>
     <w:sectPr>
       <w:pgSz w:w="12240" w:h="15840"/>
       <w:pgMar w:top="170" w:right="170" w:bottom="170" w:left="170" w:header="720" w:footer="720" w:gutter="0"/>
@@ -940,6 +958,7 @@
   <w:style w:type="character" w:default="1" w:styleId="a0">
     <w:name w:val="Default Paragraph Font"/>
     <w:uiPriority w:val="1"/>
+    <w:semiHidden/>
     <w:unhideWhenUsed/>
   </w:style>
   <w:style w:type="table" w:default="1" w:styleId="a1">

</xml_diff>

<commit_message>
The Attacktie_Directory THM CTF was finished!!!
</commit_message>
<xml_diff>
--- a/THM_challenges/Medium/Attacktive Directory/Attacktive_Directory_Solution_Documentation.docx
+++ b/THM_challenges/Medium/Attacktive Directory/Attacktive_Directory_Solution_Documentation.docx
@@ -13,7 +13,6 @@
           <w:u w:val="single"/>
         </w:rPr>
       </w:pPr>
-      <w:proofErr w:type="spellStart"/>
       <w:r>
         <w:rPr>
           <w:b/>
@@ -24,7 +23,6 @@
         </w:rPr>
         <w:t>Attacktive_Directory_Solution_Documentation</w:t>
       </w:r>
-      <w:proofErr w:type="spellEnd"/>
     </w:p>
     <w:p>
       <w:pPr>
@@ -50,27 +48,54 @@
     </w:p>
     <w:p>
       <w:r>
-        <w:t xml:space="preserve">This is my first windows machine </w:t>
-      </w:r>
-      <w:r>
-        <w:t>ctf.</w:t>
-      </w:r>
-    </w:p>
-    <w:p>
-      <w:r>
-        <w:t>I started this challenge by executing an Nmap scan:</w:t>
-      </w:r>
-    </w:p>
-    <w:p>
-      <w:r>
-        <w:rPr>
-          <w:noProof/>
-        </w:rPr>
+        <w:t xml:space="preserve">This is my first </w:t>
+      </w:r>
+      <w:r>
+        <w:t>AD</w:t>
+      </w:r>
+      <w:r>
+        <w:t xml:space="preserve"> </w:t>
+      </w:r>
+      <w:r>
+        <w:t xml:space="preserve">CTF ever so </w:t>
+      </w:r>
+      <w:r>
+        <w:t xml:space="preserve">the solution may be a bit </w:t>
+      </w:r>
+      <w:r>
+        <w:t>unprofessional</w:t>
+      </w:r>
+      <w:r>
+        <w:t>.</w:t>
+      </w:r>
+    </w:p>
+    <w:p>
+      <w:r>
+        <w:t xml:space="preserve">I started this CTF by </w:t>
+      </w:r>
+      <w:r>
+        <w:t>i</w:t>
+      </w:r>
+      <w:r>
+        <w:t>nstalling Im</w:t>
+      </w:r>
+      <w:r>
+        <w:t>pac</w:t>
+      </w:r>
+      <w:r>
+        <w:t>ket</w:t>
+      </w:r>
+      <w:r>
+        <w:t>:</w:t>
+      </w:r>
+    </w:p>
+    <w:p>
+      <w:r>
         <w:drawing>
-          <wp:inline distT="0" distB="0" distL="0" distR="0" wp14:anchorId="1D133861" wp14:editId="3EC92C6D">
-            <wp:extent cx="4635500" cy="3687217"/>
-            <wp:effectExtent l="0" t="0" r="0" b="8890"/>
-            <wp:docPr id="378888847" name="תמונה 1"/>
+          <wp:inline distT="0" distB="0" distL="0" distR="0" wp14:anchorId="4F650BD2" wp14:editId="7283637C">
+            <wp:extent cx="4705758" cy="1104996"/>
+            <wp:effectExtent l="0" t="0" r="0" b="0"/>
+            <wp:docPr id="1147783654" name="תמונה 1"/>
             <wp:cNvGraphicFramePr>
               <a:graphicFrameLocks xmlns:a="http://schemas.openxmlformats.org/drawingml/2006/main" noChangeAspect="1"/>
             </wp:cNvGraphicFramePr>
@@ -78,7 +103,7 @@
               <a:graphicData uri="http://schemas.openxmlformats.org/drawingml/2006/picture">
                 <pic:pic xmlns:pic="http://schemas.openxmlformats.org/drawingml/2006/picture">
                   <pic:nvPicPr>
-                    <pic:cNvPr id="378888847" name=""/>
+                    <pic:cNvPr id="1147783654" name=""/>
                     <pic:cNvPicPr/>
                   </pic:nvPicPr>
                   <pic:blipFill>
@@ -90,7 +115,7 @@
                   <pic:spPr>
                     <a:xfrm>
                       <a:off x="0" y="0"/>
-                      <a:ext cx="4643933" cy="3693925"/>
+                      <a:ext cx="4705758" cy="1104996"/>
                     </a:xfrm>
                     <a:prstGeom prst="rect">
                       <a:avLst/>
@@ -105,27 +130,22 @@
     </w:p>
     <w:p>
       <w:r>
-        <w:t>I saw that this target has many open ports and services.</w:t>
-      </w:r>
-    </w:p>
-    <w:p>
-      <w:r>
-        <w:t xml:space="preserve">Then I moved to enumerate </w:t>
-      </w:r>
-      <w:r>
-        <w:t>data from the windows target using “enum4linux” (which is a tool to retrieve data from windows machines based on SMB protocol):</w:t>
-      </w:r>
-    </w:p>
-    <w:p>
-      <w:r>
-        <w:rPr>
-          <w:noProof/>
-        </w:rPr>
+        <w:t xml:space="preserve">Then I installed all the required python libraries and packages </w:t>
+      </w:r>
+      <w:r>
+        <w:t>for running this tool</w:t>
+      </w:r>
+      <w:r>
+        <w:t>:</w:t>
+      </w:r>
+    </w:p>
+    <w:p>
+      <w:r>
         <w:drawing>
-          <wp:inline distT="0" distB="0" distL="0" distR="0" wp14:anchorId="5782C965" wp14:editId="6FB7E1E7">
-            <wp:extent cx="3193274" cy="723900"/>
-            <wp:effectExtent l="0" t="0" r="7620" b="0"/>
-            <wp:docPr id="1639371428" name="תמונה 1"/>
+          <wp:inline distT="0" distB="0" distL="0" distR="0" wp14:anchorId="5B801424" wp14:editId="22A54720">
+            <wp:extent cx="7556500" cy="2069465"/>
+            <wp:effectExtent l="0" t="0" r="6350" b="6985"/>
+            <wp:docPr id="1838179117" name="תמונה 1"/>
             <wp:cNvGraphicFramePr>
               <a:graphicFrameLocks xmlns:a="http://schemas.openxmlformats.org/drawingml/2006/main" noChangeAspect="1"/>
             </wp:cNvGraphicFramePr>
@@ -133,7 +153,7 @@
               <a:graphicData uri="http://schemas.openxmlformats.org/drawingml/2006/picture">
                 <pic:pic xmlns:pic="http://schemas.openxmlformats.org/drawingml/2006/picture">
                   <pic:nvPicPr>
-                    <pic:cNvPr id="1639371428" name=""/>
+                    <pic:cNvPr id="1838179117" name=""/>
                     <pic:cNvPicPr/>
                   </pic:nvPicPr>
                   <pic:blipFill>
@@ -145,7 +165,7 @@
                   <pic:spPr>
                     <a:xfrm>
                       <a:off x="0" y="0"/>
-                      <a:ext cx="3211551" cy="728043"/>
+                      <a:ext cx="7556500" cy="2069465"/>
                     </a:xfrm>
                     <a:prstGeom prst="rect">
                       <a:avLst/>
@@ -160,28 +180,16 @@
     </w:p>
     <w:p>
       <w:r>
-        <w:t xml:space="preserve">I found out what </w:t>
-      </w:r>
-      <w:r>
-        <w:t>the NetBIOS-domain name of this machine is</w:t>
-      </w:r>
-      <w:r>
-        <w:t>:</w:t>
-      </w:r>
-      <w:r>
-        <w:t xml:space="preserve"> </w:t>
-      </w:r>
-    </w:p>
-    <w:p>
-      <w:r>
-        <w:rPr>
-          <w:noProof/>
-        </w:rPr>
+        <w:t>Once the requirements have been finished, I actually installed the script:</w:t>
+      </w:r>
+    </w:p>
+    <w:p>
+      <w:r>
         <w:drawing>
-          <wp:inline distT="0" distB="0" distL="0" distR="0" wp14:anchorId="74E6E13D" wp14:editId="573DA5FA">
-            <wp:extent cx="5932684" cy="903048"/>
+          <wp:inline distT="0" distB="0" distL="0" distR="0" wp14:anchorId="5D75FC9B" wp14:editId="1268AD43">
+            <wp:extent cx="2876799" cy="331499"/>
             <wp:effectExtent l="0" t="0" r="0" b="0"/>
-            <wp:docPr id="2106910137" name="תמונה 1" descr="תמונה שמכילה טקסט, גופן, תכונות מולטימדיה, תוכנה&#10;&#10;תוכן בינה מלאכותית גנרטיבית עשוי להיות שגוי."/>
+            <wp:docPr id="488638501" name="תמונה 1"/>
             <wp:cNvGraphicFramePr>
               <a:graphicFrameLocks xmlns:a="http://schemas.openxmlformats.org/drawingml/2006/main" noChangeAspect="1"/>
             </wp:cNvGraphicFramePr>
@@ -189,7 +197,7 @@
               <a:graphicData uri="http://schemas.openxmlformats.org/drawingml/2006/picture">
                 <pic:pic xmlns:pic="http://schemas.openxmlformats.org/drawingml/2006/picture">
                   <pic:nvPicPr>
-                    <pic:cNvPr id="2106910137" name="תמונה 1" descr="תמונה שמכילה טקסט, גופן, תכונות מולטימדיה, תוכנה&#10;&#10;תוכן בינה מלאכותית גנרטיבית עשוי להיות שגוי."/>
+                    <pic:cNvPr id="488638501" name=""/>
                     <pic:cNvPicPr/>
                   </pic:nvPicPr>
                   <pic:blipFill>
@@ -201,7 +209,7 @@
                   <pic:spPr>
                     <a:xfrm>
                       <a:off x="0" y="0"/>
-                      <a:ext cx="5932684" cy="903048"/>
+                      <a:ext cx="2876799" cy="331499"/>
                     </a:xfrm>
                     <a:prstGeom prst="rect">
                       <a:avLst/>
@@ -213,51 +221,25 @@
           </wp:inline>
         </w:drawing>
       </w:r>
-      <w:r>
-        <w:t xml:space="preserve"> </w:t>
-      </w:r>
-    </w:p>
-    <w:p/>
-    <w:p/>
-    <w:p/>
-    <w:p>
-      <w:pPr>
-        <w:rPr>
-          <w:rtl/>
-        </w:rPr>
-      </w:pPr>
-    </w:p>
-    <w:p>
-      <w:r>
-        <w:lastRenderedPageBreak/>
-        <w:t>Afterwards, I moved to bruteforce credentials on the Kerberos (</w:t>
-      </w:r>
-      <w:r>
-        <w:t>a computer network authentication protocol</w:t>
-      </w:r>
-      <w:r>
-        <w:t xml:space="preserve"> used in active directory</w:t>
-      </w:r>
-      <w:r>
-        <w:t>)</w:t>
-      </w:r>
-      <w:r>
-        <w:t xml:space="preserve"> using the tool “Kerbroute”. The thm page of this challenge gave me the</w:t>
-      </w:r>
-      <w:r>
-        <w:t xml:space="preserve"> usernames and passwords wordlists files which I downloaded using “wget”:</w:t>
-      </w:r>
-    </w:p>
-    <w:p>
-      <w:r>
-        <w:rPr>
-          <w:noProof/>
-        </w:rPr>
+    </w:p>
+    <w:p>
+      <w:r>
+        <w:t xml:space="preserve">After I completed installing the Impacket, I moved to install the additional tools </w:t>
+      </w:r>
+      <w:r>
+        <w:t>Bloodhound and Neo4j</w:t>
+      </w:r>
+      <w:r>
+        <w:t>:</w:t>
+      </w:r>
+    </w:p>
+    <w:p>
+      <w:r>
         <w:drawing>
-          <wp:inline distT="0" distB="0" distL="0" distR="0" wp14:anchorId="754BB147" wp14:editId="59EAFDBB">
-            <wp:extent cx="5033433" cy="2089349"/>
-            <wp:effectExtent l="0" t="0" r="0" b="6350"/>
-            <wp:docPr id="421447334" name="תמונה 1"/>
+          <wp:inline distT="0" distB="0" distL="0" distR="0" wp14:anchorId="4566978D" wp14:editId="0BD0D085">
+            <wp:extent cx="5867908" cy="2667231"/>
+            <wp:effectExtent l="0" t="0" r="0" b="0"/>
+            <wp:docPr id="1568185272" name="תמונה 1"/>
             <wp:cNvGraphicFramePr>
               <a:graphicFrameLocks xmlns:a="http://schemas.openxmlformats.org/drawingml/2006/main" noChangeAspect="1"/>
             </wp:cNvGraphicFramePr>
@@ -265,7 +247,7 @@
               <a:graphicData uri="http://schemas.openxmlformats.org/drawingml/2006/picture">
                 <pic:pic xmlns:pic="http://schemas.openxmlformats.org/drawingml/2006/picture">
                   <pic:nvPicPr>
-                    <pic:cNvPr id="421447334" name=""/>
+                    <pic:cNvPr id="1568185272" name=""/>
                     <pic:cNvPicPr/>
                   </pic:nvPicPr>
                   <pic:blipFill>
@@ -277,7 +259,7 @@
                   <pic:spPr>
                     <a:xfrm>
                       <a:off x="0" y="0"/>
-                      <a:ext cx="5051262" cy="2096750"/>
+                      <a:ext cx="5867908" cy="2667231"/>
                     </a:xfrm>
                     <a:prstGeom prst="rect">
                       <a:avLst/>
@@ -292,25 +274,31 @@
     </w:p>
     <w:p>
       <w:r>
-        <w:t>The command that I used to execute the bruteforce attack</w:t>
-      </w:r>
-      <w:r>
-        <w:t xml:space="preserve"> and the users that I found</w:t>
-      </w:r>
-      <w:r>
-        <w:t>:</w:t>
-      </w:r>
-    </w:p>
-    <w:p>
-      <w:r>
-        <w:rPr>
-          <w:noProof/>
-        </w:rPr>
+        <w:t xml:space="preserve">And at this point, I could actually </w:t>
+      </w:r>
+      <w:r>
+        <w:t>start</w:t>
+      </w:r>
+      <w:r>
+        <w:t xml:space="preserve"> the ctf</w:t>
+      </w:r>
+      <w:r>
+        <w:t>.</w:t>
+      </w:r>
+    </w:p>
+    <w:p>
+      <w:r>
+        <w:t>I started ,as always, with Nmap scanning:</w:t>
+      </w:r>
+    </w:p>
+    <w:p>
+      <w:r>
+        <w:lastRenderedPageBreak/>
         <w:drawing>
-          <wp:inline distT="0" distB="0" distL="0" distR="0" wp14:anchorId="449D1560" wp14:editId="5949D373">
-            <wp:extent cx="4503810" cy="3105419"/>
+          <wp:inline distT="0" distB="0" distL="0" distR="0" wp14:anchorId="5B63E4A5" wp14:editId="22478382">
+            <wp:extent cx="7106266" cy="5772650"/>
             <wp:effectExtent l="0" t="0" r="0" b="0"/>
-            <wp:docPr id="1285857937" name="תמונה 1"/>
+            <wp:docPr id="226796292" name="תמונה 1"/>
             <wp:cNvGraphicFramePr>
               <a:graphicFrameLocks xmlns:a="http://schemas.openxmlformats.org/drawingml/2006/main" noChangeAspect="1"/>
             </wp:cNvGraphicFramePr>
@@ -318,7 +306,7 @@
               <a:graphicData uri="http://schemas.openxmlformats.org/drawingml/2006/picture">
                 <pic:pic xmlns:pic="http://schemas.openxmlformats.org/drawingml/2006/picture">
                   <pic:nvPicPr>
-                    <pic:cNvPr id="1285857937" name=""/>
+                    <pic:cNvPr id="226796292" name=""/>
                     <pic:cNvPicPr/>
                   </pic:nvPicPr>
                   <pic:blipFill>
@@ -330,7 +318,1162 @@
                   <pic:spPr>
                     <a:xfrm>
                       <a:off x="0" y="0"/>
-                      <a:ext cx="4503810" cy="3105419"/>
+                      <a:ext cx="7106266" cy="5772650"/>
+                    </a:xfrm>
+                    <a:prstGeom prst="rect">
+                      <a:avLst/>
+                    </a:prstGeom>
+                  </pic:spPr>
+                </pic:pic>
+              </a:graphicData>
+            </a:graphic>
+          </wp:inline>
+        </w:drawing>
+      </w:r>
+    </w:p>
+    <w:p>
+      <w:r>
+        <w:t>Here, I discovered that</w:t>
+      </w:r>
+      <w:r>
+        <w:t xml:space="preserve"> por</w:t>
+      </w:r>
+      <w:r>
+        <w:t>t</w:t>
+      </w:r>
+      <w:r>
+        <w:t xml:space="preserve"> 445</w:t>
+      </w:r>
+      <w:r>
+        <w:t xml:space="preserve"> (SMB)</w:t>
+      </w:r>
+      <w:r>
+        <w:t xml:space="preserve"> </w:t>
+      </w:r>
+      <w:r>
+        <w:t>is</w:t>
+      </w:r>
+      <w:r>
+        <w:t xml:space="preserve"> open</w:t>
+      </w:r>
+      <w:r>
+        <w:t xml:space="preserve">, so it led me to run enum4linux (a </w:t>
+      </w:r>
+      <w:r>
+        <w:t>Linux enumeration tool for windows/AD systems</w:t>
+      </w:r>
+      <w:r>
+        <w:t>)</w:t>
+      </w:r>
+      <w:r>
+        <w:t>:</w:t>
+      </w:r>
+    </w:p>
+    <w:p>
+      <w:r>
+        <w:drawing>
+          <wp:inline distT="0" distB="0" distL="0" distR="0" wp14:anchorId="36AAE569" wp14:editId="552FC5A2">
+            <wp:extent cx="1836579" cy="361981"/>
+            <wp:effectExtent l="0" t="0" r="0" b="0"/>
+            <wp:docPr id="912450217" name="תמונה 1"/>
+            <wp:cNvGraphicFramePr>
+              <a:graphicFrameLocks xmlns:a="http://schemas.openxmlformats.org/drawingml/2006/main" noChangeAspect="1"/>
+            </wp:cNvGraphicFramePr>
+            <a:graphic xmlns:a="http://schemas.openxmlformats.org/drawingml/2006/main">
+              <a:graphicData uri="http://schemas.openxmlformats.org/drawingml/2006/picture">
+                <pic:pic xmlns:pic="http://schemas.openxmlformats.org/drawingml/2006/picture">
+                  <pic:nvPicPr>
+                    <pic:cNvPr id="912450217" name=""/>
+                    <pic:cNvPicPr/>
+                  </pic:nvPicPr>
+                  <pic:blipFill>
+                    <a:blip r:embed="rId9"/>
+                    <a:stretch>
+                      <a:fillRect/>
+                    </a:stretch>
+                  </pic:blipFill>
+                  <pic:spPr>
+                    <a:xfrm>
+                      <a:off x="0" y="0"/>
+                      <a:ext cx="1836579" cy="361981"/>
+                    </a:xfrm>
+                    <a:prstGeom prst="rect">
+                      <a:avLst/>
+                    </a:prstGeom>
+                  </pic:spPr>
+                </pic:pic>
+              </a:graphicData>
+            </a:graphic>
+          </wp:inline>
+        </w:drawing>
+      </w:r>
+    </w:p>
+    <w:p>
+      <w:r>
+        <w:t xml:space="preserve">I </w:t>
+      </w:r>
+      <w:r>
+        <w:t>explored the output a bit (it had a lot of content)</w:t>
+      </w:r>
+      <w:r>
+        <w:t xml:space="preserve"> and I found </w:t>
+      </w:r>
+      <w:r>
+        <w:t>that the NetBIOS-Domain Name</w:t>
+      </w:r>
+      <w:r>
+        <w:t xml:space="preserve"> (a short domain name of </w:t>
+      </w:r>
+      <w:r>
+        <w:t>an active directory</w:t>
+      </w:r>
+      <w:r>
+        <w:t xml:space="preserve"> DNS</w:t>
+      </w:r>
+      <w:r>
+        <w:t xml:space="preserve"> domain</w:t>
+      </w:r>
+      <w:r>
+        <w:t>)</w:t>
+      </w:r>
+      <w:r>
+        <w:t xml:space="preserve"> </w:t>
+      </w:r>
+      <w:r>
+        <w:t xml:space="preserve">of the machine was </w:t>
+      </w:r>
+      <w:r>
+        <w:t>“THM-AD”</w:t>
+      </w:r>
+      <w:r>
+        <w:t xml:space="preserve">: </w:t>
+      </w:r>
+    </w:p>
+    <w:p>
+      <w:r>
+        <w:drawing>
+          <wp:inline distT="0" distB="0" distL="0" distR="0" wp14:anchorId="7D403430" wp14:editId="04744AEF">
+            <wp:extent cx="5837426" cy="899238"/>
+            <wp:effectExtent l="0" t="0" r="0" b="0"/>
+            <wp:docPr id="302333852" name="תמונה 1" descr="תמונה שמכילה טקסט, צילום מסך, גופן&#10;&#10;תוכן בינה מלאכותית גנרטיבית עשוי להיות שגוי."/>
+            <wp:cNvGraphicFramePr>
+              <a:graphicFrameLocks xmlns:a="http://schemas.openxmlformats.org/drawingml/2006/main" noChangeAspect="1"/>
+            </wp:cNvGraphicFramePr>
+            <a:graphic xmlns:a="http://schemas.openxmlformats.org/drawingml/2006/main">
+              <a:graphicData uri="http://schemas.openxmlformats.org/drawingml/2006/picture">
+                <pic:pic xmlns:pic="http://schemas.openxmlformats.org/drawingml/2006/picture">
+                  <pic:nvPicPr>
+                    <pic:cNvPr id="302333852" name="תמונה 1" descr="תמונה שמכילה טקסט, צילום מסך, גופן&#10;&#10;תוכן בינה מלאכותית גנרטיבית עשוי להיות שגוי."/>
+                    <pic:cNvPicPr/>
+                  </pic:nvPicPr>
+                  <pic:blipFill>
+                    <a:blip r:embed="rId10"/>
+                    <a:stretch>
+                      <a:fillRect/>
+                    </a:stretch>
+                  </pic:blipFill>
+                  <pic:spPr>
+                    <a:xfrm>
+                      <a:off x="0" y="0"/>
+                      <a:ext cx="5837426" cy="899238"/>
+                    </a:xfrm>
+                    <a:prstGeom prst="rect">
+                      <a:avLst/>
+                    </a:prstGeom>
+                  </pic:spPr>
+                </pic:pic>
+              </a:graphicData>
+            </a:graphic>
+          </wp:inline>
+        </w:drawing>
+      </w:r>
+    </w:p>
+    <w:p>
+      <w:r>
+        <w:t>Afterwards, I downloaded the usernames and passwords lists t</w:t>
+      </w:r>
+      <w:r>
+        <w:t>hat the author gave us to bruteforce with:</w:t>
+      </w:r>
+    </w:p>
+    <w:p>
+      <w:r>
+        <w:lastRenderedPageBreak/>
+        <w:drawing>
+          <wp:inline distT="0" distB="0" distL="0" distR="0" wp14:anchorId="7DDECD30" wp14:editId="2BCE161B">
+            <wp:extent cx="7556500" cy="1529080"/>
+            <wp:effectExtent l="0" t="0" r="6350" b="0"/>
+            <wp:docPr id="178202957" name="תמונה 1"/>
+            <wp:cNvGraphicFramePr>
+              <a:graphicFrameLocks xmlns:a="http://schemas.openxmlformats.org/drawingml/2006/main" noChangeAspect="1"/>
+            </wp:cNvGraphicFramePr>
+            <a:graphic xmlns:a="http://schemas.openxmlformats.org/drawingml/2006/main">
+              <a:graphicData uri="http://schemas.openxmlformats.org/drawingml/2006/picture">
+                <pic:pic xmlns:pic="http://schemas.openxmlformats.org/drawingml/2006/picture">
+                  <pic:nvPicPr>
+                    <pic:cNvPr id="178202957" name=""/>
+                    <pic:cNvPicPr/>
+                  </pic:nvPicPr>
+                  <pic:blipFill>
+                    <a:blip r:embed="rId11"/>
+                    <a:stretch>
+                      <a:fillRect/>
+                    </a:stretch>
+                  </pic:blipFill>
+                  <pic:spPr>
+                    <a:xfrm>
+                      <a:off x="0" y="0"/>
+                      <a:ext cx="7556500" cy="1529080"/>
+                    </a:xfrm>
+                    <a:prstGeom prst="rect">
+                      <a:avLst/>
+                    </a:prstGeom>
+                  </pic:spPr>
+                </pic:pic>
+              </a:graphicData>
+            </a:graphic>
+          </wp:inline>
+        </w:drawing>
+      </w:r>
+    </w:p>
+    <w:p>
+      <w:r>
+        <w:t>Before I run the Kerbrute command</w:t>
+      </w:r>
+      <w:r>
+        <w:t xml:space="preserve">, I needed to supply the DNS domain of the </w:t>
+      </w:r>
+      <w:r>
+        <w:t>active directory</w:t>
+      </w:r>
+      <w:r>
+        <w:t xml:space="preserve"> (because I just was given the NetBIOS domain name and not the DNS one)</w:t>
+      </w:r>
+      <w:r>
+        <w:t>. Therefore, I used a tool named “</w:t>
+      </w:r>
+      <w:r>
+        <w:t>C</w:t>
+      </w:r>
+      <w:r>
+        <w:t>rackmapexec”</w:t>
+      </w:r>
+      <w:r>
+        <w:t xml:space="preserve"> </w:t>
+      </w:r>
+      <w:r>
+        <w:t>to find it:</w:t>
+      </w:r>
+    </w:p>
+    <w:p>
+      <w:r>
+        <w:drawing>
+          <wp:inline distT="0" distB="0" distL="0" distR="0" wp14:anchorId="67E5D20E" wp14:editId="76B84DA2">
+            <wp:extent cx="7190093" cy="1867062"/>
+            <wp:effectExtent l="0" t="0" r="0" b="0"/>
+            <wp:docPr id="1293204241" name="תמונה 1"/>
+            <wp:cNvGraphicFramePr>
+              <a:graphicFrameLocks xmlns:a="http://schemas.openxmlformats.org/drawingml/2006/main" noChangeAspect="1"/>
+            </wp:cNvGraphicFramePr>
+            <a:graphic xmlns:a="http://schemas.openxmlformats.org/drawingml/2006/main">
+              <a:graphicData uri="http://schemas.openxmlformats.org/drawingml/2006/picture">
+                <pic:pic xmlns:pic="http://schemas.openxmlformats.org/drawingml/2006/picture">
+                  <pic:nvPicPr>
+                    <pic:cNvPr id="1293204241" name=""/>
+                    <pic:cNvPicPr/>
+                  </pic:nvPicPr>
+                  <pic:blipFill>
+                    <a:blip r:embed="rId12"/>
+                    <a:stretch>
+                      <a:fillRect/>
+                    </a:stretch>
+                  </pic:blipFill>
+                  <pic:spPr>
+                    <a:xfrm>
+                      <a:off x="0" y="0"/>
+                      <a:ext cx="7190093" cy="1867062"/>
+                    </a:xfrm>
+                    <a:prstGeom prst="rect">
+                      <a:avLst/>
+                    </a:prstGeom>
+                  </pic:spPr>
+                </pic:pic>
+              </a:graphicData>
+            </a:graphic>
+          </wp:inline>
+        </w:drawing>
+      </w:r>
+    </w:p>
+    <w:p>
+      <w:r>
+        <w:t xml:space="preserve">And then I run the user enumeration over the machine using </w:t>
+      </w:r>
+      <w:r>
+        <w:t>Kerbrute</w:t>
+      </w:r>
+      <w:r>
+        <w:t>:</w:t>
+      </w:r>
+    </w:p>
+    <w:p>
+      <w:r>
+        <w:drawing>
+          <wp:inline distT="0" distB="0" distL="0" distR="0" wp14:anchorId="1404E318" wp14:editId="1A88DD6C">
+            <wp:extent cx="4637172" cy="3570279"/>
+            <wp:effectExtent l="0" t="0" r="0" b="0"/>
+            <wp:docPr id="1705803115" name="תמונה 1"/>
+            <wp:cNvGraphicFramePr>
+              <a:graphicFrameLocks xmlns:a="http://schemas.openxmlformats.org/drawingml/2006/main" noChangeAspect="1"/>
+            </wp:cNvGraphicFramePr>
+            <a:graphic xmlns:a="http://schemas.openxmlformats.org/drawingml/2006/main">
+              <a:graphicData uri="http://schemas.openxmlformats.org/drawingml/2006/picture">
+                <pic:pic xmlns:pic="http://schemas.openxmlformats.org/drawingml/2006/picture">
+                  <pic:nvPicPr>
+                    <pic:cNvPr id="1705803115" name=""/>
+                    <pic:cNvPicPr/>
+                  </pic:nvPicPr>
+                  <pic:blipFill>
+                    <a:blip r:embed="rId13"/>
+                    <a:stretch>
+                      <a:fillRect/>
+                    </a:stretch>
+                  </pic:blipFill>
+                  <pic:spPr>
+                    <a:xfrm>
+                      <a:off x="0" y="0"/>
+                      <a:ext cx="4637172" cy="3570279"/>
+                    </a:xfrm>
+                    <a:prstGeom prst="rect">
+                      <a:avLst/>
+                    </a:prstGeom>
+                  </pic:spPr>
+                </pic:pic>
+              </a:graphicData>
+            </a:graphic>
+          </wp:inline>
+        </w:drawing>
+      </w:r>
+    </w:p>
+    <w:p>
+      <w:r>
+        <w:t xml:space="preserve">Here I found the </w:t>
+      </w:r>
+      <w:r>
+        <w:t xml:space="preserve">notable </w:t>
+      </w:r>
+      <w:r>
+        <w:t>user</w:t>
+      </w:r>
+      <w:r>
+        <w:t>s</w:t>
+      </w:r>
+      <w:r>
+        <w:t xml:space="preserve"> “svc-admin”</w:t>
+      </w:r>
+      <w:r>
+        <w:t xml:space="preserve"> and “</w:t>
+      </w:r>
+      <w:r>
+        <w:t>backup”</w:t>
+      </w:r>
+      <w:r>
+        <w:t>.</w:t>
+      </w:r>
+    </w:p>
+    <w:p>
+      <w:r>
+        <w:t xml:space="preserve">Afterwards, I checked with </w:t>
+      </w:r>
+      <w:r>
+        <w:t xml:space="preserve">the utility “GetNPUsers.py” </w:t>
+      </w:r>
+      <w:r>
+        <w:t>which of the 2 notable users ha</w:t>
+      </w:r>
+      <w:r>
+        <w:t xml:space="preserve">s the privilege </w:t>
+      </w:r>
+      <w:r>
+        <w:t>"Does not require Pre-Authentication"</w:t>
+      </w:r>
+      <w:r>
+        <w:t xml:space="preserve"> (</w:t>
+      </w:r>
+      <w:r>
+        <w:t xml:space="preserve">A privilege that </w:t>
+      </w:r>
+      <w:r>
+        <w:t xml:space="preserve">allow us </w:t>
+      </w:r>
+      <w:r>
+        <w:t xml:space="preserve">to </w:t>
+      </w:r>
+      <w:r>
+        <w:t xml:space="preserve">get </w:t>
+      </w:r>
+      <w:r>
+        <w:t xml:space="preserve">a Kerberos </w:t>
+      </w:r>
+      <w:r>
+        <w:t>ticket</w:t>
+      </w:r>
+      <w:r>
+        <w:t xml:space="preserve"> </w:t>
+      </w:r>
+      <w:r>
+        <w:t>without need to authenticate</w:t>
+      </w:r>
+      <w:r>
+        <w:t>)</w:t>
+      </w:r>
+      <w:r>
+        <w:t>:</w:t>
+      </w:r>
+    </w:p>
+    <w:p>
+      <w:r>
+        <w:lastRenderedPageBreak/>
+        <w:drawing>
+          <wp:inline distT="0" distB="0" distL="0" distR="0" wp14:anchorId="58AF1682" wp14:editId="14C5DAF3">
+            <wp:extent cx="5532599" cy="1703218"/>
+            <wp:effectExtent l="0" t="0" r="0" b="0"/>
+            <wp:docPr id="675006844" name="תמונה 1" descr="תמונה שמכילה טקסט, צילום מסך, גופן&#10;&#10;תוכן בינה מלאכותית גנרטיבית עשוי להיות שגוי."/>
+            <wp:cNvGraphicFramePr>
+              <a:graphicFrameLocks xmlns:a="http://schemas.openxmlformats.org/drawingml/2006/main" noChangeAspect="1"/>
+            </wp:cNvGraphicFramePr>
+            <a:graphic xmlns:a="http://schemas.openxmlformats.org/drawingml/2006/main">
+              <a:graphicData uri="http://schemas.openxmlformats.org/drawingml/2006/picture">
+                <pic:pic xmlns:pic="http://schemas.openxmlformats.org/drawingml/2006/picture">
+                  <pic:nvPicPr>
+                    <pic:cNvPr id="675006844" name="תמונה 1" descr="תמונה שמכילה טקסט, צילום מסך, גופן&#10;&#10;תוכן בינה מלאכותית גנרטיבית עשוי להיות שגוי."/>
+                    <pic:cNvPicPr/>
+                  </pic:nvPicPr>
+                  <pic:blipFill>
+                    <a:blip r:embed="rId14"/>
+                    <a:stretch>
+                      <a:fillRect/>
+                    </a:stretch>
+                  </pic:blipFill>
+                  <pic:spPr>
+                    <a:xfrm>
+                      <a:off x="0" y="0"/>
+                      <a:ext cx="5532599" cy="1703218"/>
+                    </a:xfrm>
+                    <a:prstGeom prst="rect">
+                      <a:avLst/>
+                    </a:prstGeom>
+                  </pic:spPr>
+                </pic:pic>
+              </a:graphicData>
+            </a:graphic>
+          </wp:inline>
+        </w:drawing>
+      </w:r>
+    </w:p>
+    <w:p>
+      <w:r>
+        <w:t xml:space="preserve">I found on </w:t>
+      </w:r>
+      <w:hyperlink r:id="rId15" w:history="1">
+        <w:r>
+          <w:rPr>
+            <w:rStyle w:val="Hyperlink"/>
+          </w:rPr>
+          <w:t>Hashcat examples wi</w:t>
+        </w:r>
+        <w:r>
+          <w:rPr>
+            <w:rStyle w:val="Hyperlink"/>
+          </w:rPr>
+          <w:t>ki page</w:t>
+        </w:r>
+      </w:hyperlink>
+      <w:r>
+        <w:t xml:space="preserve"> that this hash</w:t>
+      </w:r>
+      <w:r>
+        <w:t>’s</w:t>
+      </w:r>
+      <w:r>
+        <w:t xml:space="preserve"> </w:t>
+      </w:r>
+      <w:r>
+        <w:t xml:space="preserve">type </w:t>
+      </w:r>
+      <w:r>
+        <w:t xml:space="preserve">is </w:t>
+      </w:r>
+      <w:r>
+        <w:t>“</w:t>
+      </w:r>
+      <w:r>
+        <w:t>Kerberos 5, etype 23, AS-REP</w:t>
+      </w:r>
+      <w:r>
+        <w:t>”</w:t>
+      </w:r>
+      <w:r>
+        <w:t xml:space="preserve"> and its mode it “18200”.</w:t>
+      </w:r>
+    </w:p>
+    <w:p>
+      <w:r>
+        <w:t>Thereafter, I bruteforce for svc-admin’s password using Kerbrute:</w:t>
+      </w:r>
+    </w:p>
+    <w:p>
+      <w:r>
+        <w:drawing>
+          <wp:inline distT="0" distB="0" distL="0" distR="0" wp14:anchorId="71DC9AE9" wp14:editId="372FBF67">
+            <wp:extent cx="5334462" cy="1836579"/>
+            <wp:effectExtent l="0" t="0" r="0" b="0"/>
+            <wp:docPr id="44052773" name="תמונה 1"/>
+            <wp:cNvGraphicFramePr>
+              <a:graphicFrameLocks xmlns:a="http://schemas.openxmlformats.org/drawingml/2006/main" noChangeAspect="1"/>
+            </wp:cNvGraphicFramePr>
+            <a:graphic xmlns:a="http://schemas.openxmlformats.org/drawingml/2006/main">
+              <a:graphicData uri="http://schemas.openxmlformats.org/drawingml/2006/picture">
+                <pic:pic xmlns:pic="http://schemas.openxmlformats.org/drawingml/2006/picture">
+                  <pic:nvPicPr>
+                    <pic:cNvPr id="44052773" name=""/>
+                    <pic:cNvPicPr/>
+                  </pic:nvPicPr>
+                  <pic:blipFill>
+                    <a:blip r:embed="rId16"/>
+                    <a:stretch>
+                      <a:fillRect/>
+                    </a:stretch>
+                  </pic:blipFill>
+                  <pic:spPr>
+                    <a:xfrm>
+                      <a:off x="0" y="0"/>
+                      <a:ext cx="5334462" cy="1836579"/>
+                    </a:xfrm>
+                    <a:prstGeom prst="rect">
+                      <a:avLst/>
+                    </a:prstGeom>
+                  </pic:spPr>
+                </pic:pic>
+              </a:graphicData>
+            </a:graphic>
+          </wp:inline>
+        </w:drawing>
+      </w:r>
+    </w:p>
+    <w:p>
+      <w:r>
+        <w:t xml:space="preserve">And I found that </w:t>
+      </w:r>
+      <w:r>
+        <w:t>the right</w:t>
+      </w:r>
+      <w:r>
+        <w:t xml:space="preserve"> password </w:t>
+      </w:r>
+      <w:r>
+        <w:t>for “svc-admin”</w:t>
+      </w:r>
+      <w:r>
+        <w:t xml:space="preserve"> </w:t>
+      </w:r>
+      <w:r>
+        <w:t>is “management2005”!</w:t>
+      </w:r>
+    </w:p>
+    <w:p/>
+    <w:p>
+      <w:r>
+        <w:t xml:space="preserve">After </w:t>
+      </w:r>
+      <w:r>
+        <w:t>resolving</w:t>
+      </w:r>
+      <w:r>
+        <w:t xml:space="preserve"> the</w:t>
+      </w:r>
+      <w:r>
+        <w:t xml:space="preserve"> credentials of an account in the Active Directory, I can </w:t>
+      </w:r>
+      <w:r>
+        <w:t>enumerate shares that the domain controller may give me.</w:t>
+      </w:r>
+      <w:r>
+        <w:t xml:space="preserve"> I used the tool “smbclient” to </w:t>
+      </w:r>
+      <w:r>
+        <w:t>map remote SMB shares:</w:t>
+      </w:r>
+    </w:p>
+    <w:p>
+      <w:r>
+        <w:drawing>
+          <wp:inline distT="0" distB="0" distL="0" distR="0" wp14:anchorId="37C2514E" wp14:editId="34B5E412">
+            <wp:extent cx="4972481" cy="1798476"/>
+            <wp:effectExtent l="0" t="0" r="0" b="0"/>
+            <wp:docPr id="1108632412" name="תמונה 1"/>
+            <wp:cNvGraphicFramePr>
+              <a:graphicFrameLocks xmlns:a="http://schemas.openxmlformats.org/drawingml/2006/main" noChangeAspect="1"/>
+            </wp:cNvGraphicFramePr>
+            <a:graphic xmlns:a="http://schemas.openxmlformats.org/drawingml/2006/main">
+              <a:graphicData uri="http://schemas.openxmlformats.org/drawingml/2006/picture">
+                <pic:pic xmlns:pic="http://schemas.openxmlformats.org/drawingml/2006/picture">
+                  <pic:nvPicPr>
+                    <pic:cNvPr id="1108632412" name=""/>
+                    <pic:cNvPicPr/>
+                  </pic:nvPicPr>
+                  <pic:blipFill>
+                    <a:blip r:embed="rId17"/>
+                    <a:stretch>
+                      <a:fillRect/>
+                    </a:stretch>
+                  </pic:blipFill>
+                  <pic:spPr>
+                    <a:xfrm>
+                      <a:off x="0" y="0"/>
+                      <a:ext cx="4972481" cy="1798476"/>
+                    </a:xfrm>
+                    <a:prstGeom prst="rect">
+                      <a:avLst/>
+                    </a:prstGeom>
+                  </pic:spPr>
+                </pic:pic>
+              </a:graphicData>
+            </a:graphic>
+          </wp:inline>
+        </w:drawing>
+      </w:r>
+    </w:p>
+    <w:p>
+      <w:r>
+        <w:t xml:space="preserve">Here I </w:t>
+      </w:r>
+      <w:r>
+        <w:t>noticed th</w:t>
+      </w:r>
+      <w:r>
+        <w:t>at I have access to the share named “</w:t>
+      </w:r>
+      <w:r>
+        <w:t>backup</w:t>
+      </w:r>
+      <w:r>
+        <w:t xml:space="preserve">” </w:t>
+      </w:r>
+      <w:r>
+        <w:t>that have a txt file inside it:</w:t>
+      </w:r>
+    </w:p>
+    <w:p>
+      <w:r>
+        <w:drawing>
+          <wp:inline distT="0" distB="0" distL="0" distR="0" wp14:anchorId="7081EA0D" wp14:editId="42FCE856">
+            <wp:extent cx="4141829" cy="1333616"/>
+            <wp:effectExtent l="0" t="0" r="0" b="0"/>
+            <wp:docPr id="1347464031" name="תמונה 1"/>
+            <wp:cNvGraphicFramePr>
+              <a:graphicFrameLocks xmlns:a="http://schemas.openxmlformats.org/drawingml/2006/main" noChangeAspect="1"/>
+            </wp:cNvGraphicFramePr>
+            <a:graphic xmlns:a="http://schemas.openxmlformats.org/drawingml/2006/main">
+              <a:graphicData uri="http://schemas.openxmlformats.org/drawingml/2006/picture">
+                <pic:pic xmlns:pic="http://schemas.openxmlformats.org/drawingml/2006/picture">
+                  <pic:nvPicPr>
+                    <pic:cNvPr id="1347464031" name=""/>
+                    <pic:cNvPicPr/>
+                  </pic:nvPicPr>
+                  <pic:blipFill>
+                    <a:blip r:embed="rId18"/>
+                    <a:stretch>
+                      <a:fillRect/>
+                    </a:stretch>
+                  </pic:blipFill>
+                  <pic:spPr>
+                    <a:xfrm>
+                      <a:off x="0" y="0"/>
+                      <a:ext cx="4141829" cy="1333616"/>
+                    </a:xfrm>
+                    <a:prstGeom prst="rect">
+                      <a:avLst/>
+                    </a:prstGeom>
+                  </pic:spPr>
+                </pic:pic>
+              </a:graphicData>
+            </a:graphic>
+          </wp:inline>
+        </w:drawing>
+      </w:r>
+    </w:p>
+    <w:p>
+      <w:r>
+        <w:t>Using the “get” command I was managed to download it:</w:t>
+      </w:r>
+    </w:p>
+    <w:p>
+      <w:r>
+        <w:lastRenderedPageBreak/>
+        <w:drawing>
+          <wp:inline distT="0" distB="0" distL="0" distR="0" wp14:anchorId="048B8725" wp14:editId="77CC4EEF">
+            <wp:extent cx="6732853" cy="266723"/>
+            <wp:effectExtent l="0" t="0" r="0" b="0"/>
+            <wp:docPr id="2001868720" name="תמונה 1"/>
+            <wp:cNvGraphicFramePr>
+              <a:graphicFrameLocks xmlns:a="http://schemas.openxmlformats.org/drawingml/2006/main" noChangeAspect="1"/>
+            </wp:cNvGraphicFramePr>
+            <a:graphic xmlns:a="http://schemas.openxmlformats.org/drawingml/2006/main">
+              <a:graphicData uri="http://schemas.openxmlformats.org/drawingml/2006/picture">
+                <pic:pic xmlns:pic="http://schemas.openxmlformats.org/drawingml/2006/picture">
+                  <pic:nvPicPr>
+                    <pic:cNvPr id="2001868720" name=""/>
+                    <pic:cNvPicPr/>
+                  </pic:nvPicPr>
+                  <pic:blipFill>
+                    <a:blip r:embed="rId19"/>
+                    <a:stretch>
+                      <a:fillRect/>
+                    </a:stretch>
+                  </pic:blipFill>
+                  <pic:spPr>
+                    <a:xfrm>
+                      <a:off x="0" y="0"/>
+                      <a:ext cx="6732853" cy="266723"/>
+                    </a:xfrm>
+                    <a:prstGeom prst="rect">
+                      <a:avLst/>
+                    </a:prstGeom>
+                  </pic:spPr>
+                </pic:pic>
+              </a:graphicData>
+            </a:graphic>
+          </wp:inline>
+        </w:drawing>
+      </w:r>
+    </w:p>
+    <w:p>
+      <w:r>
+        <w:t>And this is its content:</w:t>
+      </w:r>
+    </w:p>
+    <w:p>
+      <w:r>
+        <w:drawing>
+          <wp:inline distT="0" distB="0" distL="0" distR="0" wp14:anchorId="50C3D69E" wp14:editId="2C91254A">
+            <wp:extent cx="2800593" cy="476291"/>
+            <wp:effectExtent l="0" t="0" r="0" b="0"/>
+            <wp:docPr id="154187718" name="תמונה 1" descr="תמונה שמכילה טקסט, גופן, צילום מסך, גרפיקה&#10;&#10;תוכן בינה מלאכותית גנרטיבית עשוי להיות שגוי."/>
+            <wp:cNvGraphicFramePr>
+              <a:graphicFrameLocks xmlns:a="http://schemas.openxmlformats.org/drawingml/2006/main" noChangeAspect="1"/>
+            </wp:cNvGraphicFramePr>
+            <a:graphic xmlns:a="http://schemas.openxmlformats.org/drawingml/2006/main">
+              <a:graphicData uri="http://schemas.openxmlformats.org/drawingml/2006/picture">
+                <pic:pic xmlns:pic="http://schemas.openxmlformats.org/drawingml/2006/picture">
+                  <pic:nvPicPr>
+                    <pic:cNvPr id="154187718" name="תמונה 1" descr="תמונה שמכילה טקסט, גופן, צילום מסך, גרפיקה&#10;&#10;תוכן בינה מלאכותית גנרטיבית עשוי להיות שגוי."/>
+                    <pic:cNvPicPr/>
+                  </pic:nvPicPr>
+                  <pic:blipFill>
+                    <a:blip r:embed="rId20"/>
+                    <a:stretch>
+                      <a:fillRect/>
+                    </a:stretch>
+                  </pic:blipFill>
+                  <pic:spPr>
+                    <a:xfrm>
+                      <a:off x="0" y="0"/>
+                      <a:ext cx="2800593" cy="476291"/>
+                    </a:xfrm>
+                    <a:prstGeom prst="rect">
+                      <a:avLst/>
+                    </a:prstGeom>
+                  </pic:spPr>
+                </pic:pic>
+              </a:graphicData>
+            </a:graphic>
+          </wp:inline>
+        </w:drawing>
+      </w:r>
+    </w:p>
+    <w:p>
+      <w:r>
+        <w:t xml:space="preserve">Immediately, as I saw the file’s content,  I </w:t>
+      </w:r>
+      <w:r>
+        <w:t>concluded</w:t>
+      </w:r>
+      <w:r>
+        <w:t xml:space="preserve"> that this is probably an encrypted text, most likely base64, which </w:t>
+      </w:r>
+      <w:r>
+        <w:t xml:space="preserve">after </w:t>
+      </w:r>
+      <w:r>
+        <w:t>simple</w:t>
+      </w:r>
+      <w:r>
+        <w:t xml:space="preserve"> decryption turned out to be true:</w:t>
+      </w:r>
+    </w:p>
+    <w:p>
+      <w:r>
+        <w:drawing>
+          <wp:inline distT="0" distB="0" distL="0" distR="0" wp14:anchorId="064D9F05" wp14:editId="6ADA2B33">
+            <wp:extent cx="4237087" cy="4172312"/>
+            <wp:effectExtent l="0" t="0" r="0" b="0"/>
+            <wp:docPr id="1998644338" name="תמונה 1"/>
+            <wp:cNvGraphicFramePr>
+              <a:graphicFrameLocks xmlns:a="http://schemas.openxmlformats.org/drawingml/2006/main" noChangeAspect="1"/>
+            </wp:cNvGraphicFramePr>
+            <a:graphic xmlns:a="http://schemas.openxmlformats.org/drawingml/2006/main">
+              <a:graphicData uri="http://schemas.openxmlformats.org/drawingml/2006/picture">
+                <pic:pic xmlns:pic="http://schemas.openxmlformats.org/drawingml/2006/picture">
+                  <pic:nvPicPr>
+                    <pic:cNvPr id="1998644338" name=""/>
+                    <pic:cNvPicPr/>
+                  </pic:nvPicPr>
+                  <pic:blipFill>
+                    <a:blip r:embed="rId21"/>
+                    <a:stretch>
+                      <a:fillRect/>
+                    </a:stretch>
+                  </pic:blipFill>
+                  <pic:spPr>
+                    <a:xfrm>
+                      <a:off x="0" y="0"/>
+                      <a:ext cx="4237087" cy="4172312"/>
+                    </a:xfrm>
+                    <a:prstGeom prst="rect">
+                      <a:avLst/>
+                    </a:prstGeom>
+                  </pic:spPr>
+                </pic:pic>
+              </a:graphicData>
+            </a:graphic>
+          </wp:inline>
+        </w:drawing>
+      </w:r>
+    </w:p>
+    <w:p>
+      <w:r>
+        <w:t>The decrypted text is: “</w:t>
+      </w:r>
+      <w:r>
+        <w:t>backup@spookysec.local:backup2517860</w:t>
+      </w:r>
+      <w:r>
+        <w:t>”</w:t>
+      </w:r>
+      <w:r>
+        <w:t>.</w:t>
+      </w:r>
+    </w:p>
+    <w:p>
+      <w:r>
+        <w:t>After fast googling about this format, I understood that I found backup user’s password which is “backup2517860”.</w:t>
+      </w:r>
+    </w:p>
+    <w:p>
+      <w:r>
+        <w:t>Afterwards, I used the Impacket’s utility named “secretsdump.py” to</w:t>
+      </w:r>
+      <w:r>
+        <w:t xml:space="preserve"> retrieve </w:t>
+      </w:r>
+      <w:r>
+        <w:t>user’s</w:t>
+      </w:r>
+      <w:r>
+        <w:t xml:space="preserve"> password</w:t>
+      </w:r>
+      <w:r>
+        <w:t>s</w:t>
+      </w:r>
+      <w:r>
+        <w:t xml:space="preserve"> hashes from the </w:t>
+      </w:r>
+      <w:r>
+        <w:t>NTDS.DIT</w:t>
+      </w:r>
+      <w:r>
+        <w:t>:</w:t>
+      </w:r>
+    </w:p>
+    <w:p>
+      <w:r>
+        <w:drawing>
+          <wp:inline distT="0" distB="0" distL="0" distR="0" wp14:anchorId="3988520E" wp14:editId="3DC0C205">
+            <wp:extent cx="5201101" cy="266723"/>
+            <wp:effectExtent l="0" t="0" r="0" b="0"/>
+            <wp:docPr id="444128444" name="תמונה 1"/>
+            <wp:cNvGraphicFramePr>
+              <a:graphicFrameLocks xmlns:a="http://schemas.openxmlformats.org/drawingml/2006/main" noChangeAspect="1"/>
+            </wp:cNvGraphicFramePr>
+            <a:graphic xmlns:a="http://schemas.openxmlformats.org/drawingml/2006/main">
+              <a:graphicData uri="http://schemas.openxmlformats.org/drawingml/2006/picture">
+                <pic:pic xmlns:pic="http://schemas.openxmlformats.org/drawingml/2006/picture">
+                  <pic:nvPicPr>
+                    <pic:cNvPr id="444128444" name=""/>
+                    <pic:cNvPicPr/>
+                  </pic:nvPicPr>
+                  <pic:blipFill>
+                    <a:blip r:embed="rId22"/>
+                    <a:stretch>
+                      <a:fillRect/>
+                    </a:stretch>
+                  </pic:blipFill>
+                  <pic:spPr>
+                    <a:xfrm>
+                      <a:off x="0" y="0"/>
+                      <a:ext cx="5201101" cy="266723"/>
+                    </a:xfrm>
+                    <a:prstGeom prst="rect">
+                      <a:avLst/>
+                    </a:prstGeom>
+                  </pic:spPr>
+                </pic:pic>
+              </a:graphicData>
+            </a:graphic>
+          </wp:inline>
+        </w:drawing>
+      </w:r>
+    </w:p>
+    <w:p>
+      <w:r>
+        <w:t>And found the Administrator’s NTLM hash:</w:t>
+      </w:r>
+    </w:p>
+    <w:p>
+      <w:r>
+        <w:drawing>
+          <wp:inline distT="0" distB="0" distL="0" distR="0" wp14:anchorId="6B8C728D" wp14:editId="06137CE5">
+            <wp:extent cx="4743861" cy="171465"/>
+            <wp:effectExtent l="0" t="0" r="0" b="0"/>
+            <wp:docPr id="1020369204" name="תמונה 1"/>
+            <wp:cNvGraphicFramePr>
+              <a:graphicFrameLocks xmlns:a="http://schemas.openxmlformats.org/drawingml/2006/main" noChangeAspect="1"/>
+            </wp:cNvGraphicFramePr>
+            <a:graphic xmlns:a="http://schemas.openxmlformats.org/drawingml/2006/main">
+              <a:graphicData uri="http://schemas.openxmlformats.org/drawingml/2006/picture">
+                <pic:pic xmlns:pic="http://schemas.openxmlformats.org/drawingml/2006/picture">
+                  <pic:nvPicPr>
+                    <pic:cNvPr id="1020369204" name=""/>
+                    <pic:cNvPicPr/>
+                  </pic:nvPicPr>
+                  <pic:blipFill>
+                    <a:blip r:embed="rId23"/>
+                    <a:stretch>
+                      <a:fillRect/>
+                    </a:stretch>
+                  </pic:blipFill>
+                  <pic:spPr>
+                    <a:xfrm>
+                      <a:off x="0" y="0"/>
+                      <a:ext cx="4743861" cy="171465"/>
+                    </a:xfrm>
+                    <a:prstGeom prst="rect">
+                      <a:avLst/>
+                    </a:prstGeom>
+                  </pic:spPr>
+                </pic:pic>
+              </a:graphicData>
+            </a:graphic>
+          </wp:inline>
+        </w:drawing>
+      </w:r>
+    </w:p>
+    <w:p>
+      <w:r>
+        <w:t xml:space="preserve">Now, instead of trying and decrypting the hash’s password, I can </w:t>
+      </w:r>
+      <w:r>
+        <w:t xml:space="preserve">perform “Pass the Hash” </w:t>
+      </w:r>
+      <w:r>
+        <w:t xml:space="preserve">method </w:t>
+      </w:r>
+      <w:r>
+        <w:t>in order to login directly with the NTLM hash itself</w:t>
+      </w:r>
+      <w:r>
+        <w:t>:</w:t>
+      </w:r>
+    </w:p>
+    <w:p>
+      <w:r>
+        <w:drawing>
+          <wp:inline distT="0" distB="0" distL="0" distR="0" wp14:anchorId="0BFC4E21" wp14:editId="694E0068">
+            <wp:extent cx="4896274" cy="533446"/>
+            <wp:effectExtent l="0" t="0" r="0" b="0"/>
+            <wp:docPr id="419069674" name="תמונה 1"/>
+            <wp:cNvGraphicFramePr>
+              <a:graphicFrameLocks xmlns:a="http://schemas.openxmlformats.org/drawingml/2006/main" noChangeAspect="1"/>
+            </wp:cNvGraphicFramePr>
+            <a:graphic xmlns:a="http://schemas.openxmlformats.org/drawingml/2006/main">
+              <a:graphicData uri="http://schemas.openxmlformats.org/drawingml/2006/picture">
+                <pic:pic xmlns:pic="http://schemas.openxmlformats.org/drawingml/2006/picture">
+                  <pic:nvPicPr>
+                    <pic:cNvPr id="419069674" name=""/>
+                    <pic:cNvPicPr/>
+                  </pic:nvPicPr>
+                  <pic:blipFill>
+                    <a:blip r:embed="rId24"/>
+                    <a:stretch>
+                      <a:fillRect/>
+                    </a:stretch>
+                  </pic:blipFill>
+                  <pic:spPr>
+                    <a:xfrm>
+                      <a:off x="0" y="0"/>
+                      <a:ext cx="4896274" cy="533446"/>
+                    </a:xfrm>
+                    <a:prstGeom prst="rect">
+                      <a:avLst/>
+                    </a:prstGeom>
+                  </pic:spPr>
+                </pic:pic>
+              </a:graphicData>
+            </a:graphic>
+          </wp:inline>
+        </w:drawing>
+      </w:r>
+    </w:p>
+    <w:p>
+      <w:r>
+        <w:t>Notice: evil-winrm creates a powershell based shell.</w:t>
+      </w:r>
+    </w:p>
+    <w:p>
+      <w:r>
+        <w:lastRenderedPageBreak/>
+        <w:t>And a</w:t>
+      </w:r>
+      <w:r>
+        <w:t>f</w:t>
+      </w:r>
+      <w:r>
+        <w:t xml:space="preserve">ter short </w:t>
+      </w:r>
+      <w:r>
+        <w:t>directories navigation, I found that all the flags are in the user</w:t>
+      </w:r>
+      <w:r>
+        <w:t>s</w:t>
+      </w:r>
+      <w:r>
+        <w:t xml:space="preserve">’ </w:t>
+      </w:r>
+      <w:r>
+        <w:t>deskto</w:t>
+      </w:r>
+      <w:r>
+        <w:t>p</w:t>
+      </w:r>
+      <w:r>
+        <w:t>:</w:t>
+      </w:r>
+    </w:p>
+    <w:p>
+      <w:r>
+        <w:drawing>
+          <wp:inline distT="0" distB="0" distL="0" distR="0" wp14:anchorId="75AA6F5A" wp14:editId="267EC4F6">
+            <wp:extent cx="3372142" cy="304826"/>
+            <wp:effectExtent l="0" t="0" r="0" b="0"/>
+            <wp:docPr id="99400287" name="תמונה 1"/>
+            <wp:cNvGraphicFramePr>
+              <a:graphicFrameLocks xmlns:a="http://schemas.openxmlformats.org/drawingml/2006/main" noChangeAspect="1"/>
+            </wp:cNvGraphicFramePr>
+            <a:graphic xmlns:a="http://schemas.openxmlformats.org/drawingml/2006/main">
+              <a:graphicData uri="http://schemas.openxmlformats.org/drawingml/2006/picture">
+                <pic:pic xmlns:pic="http://schemas.openxmlformats.org/drawingml/2006/picture">
+                  <pic:nvPicPr>
+                    <pic:cNvPr id="99400287" name=""/>
+                    <pic:cNvPicPr/>
+                  </pic:nvPicPr>
+                  <pic:blipFill>
+                    <a:blip r:embed="rId25"/>
+                    <a:stretch>
+                      <a:fillRect/>
+                    </a:stretch>
+                  </pic:blipFill>
+                  <pic:spPr>
+                    <a:xfrm>
+                      <a:off x="0" y="0"/>
+                      <a:ext cx="3372142" cy="304826"/>
+                    </a:xfrm>
+                    <a:prstGeom prst="rect">
+                      <a:avLst/>
+                    </a:prstGeom>
+                  </pic:spPr>
+                </pic:pic>
+              </a:graphicData>
+            </a:graphic>
+          </wp:inline>
+        </w:drawing>
+      </w:r>
+    </w:p>
+    <w:p>
+      <w:r>
+        <w:drawing>
+          <wp:inline distT="0" distB="0" distL="0" distR="0" wp14:anchorId="2920EBC1" wp14:editId="6F010A46">
+            <wp:extent cx="3170195" cy="274344"/>
+            <wp:effectExtent l="0" t="0" r="0" b="0"/>
+            <wp:docPr id="1094716852" name="תמונה 1"/>
+            <wp:cNvGraphicFramePr>
+              <a:graphicFrameLocks xmlns:a="http://schemas.openxmlformats.org/drawingml/2006/main" noChangeAspect="1"/>
+            </wp:cNvGraphicFramePr>
+            <a:graphic xmlns:a="http://schemas.openxmlformats.org/drawingml/2006/main">
+              <a:graphicData uri="http://schemas.openxmlformats.org/drawingml/2006/picture">
+                <pic:pic xmlns:pic="http://schemas.openxmlformats.org/drawingml/2006/picture">
+                  <pic:nvPicPr>
+                    <pic:cNvPr id="1094716852" name=""/>
+                    <pic:cNvPicPr/>
+                  </pic:nvPicPr>
+                  <pic:blipFill>
+                    <a:blip r:embed="rId26"/>
+                    <a:stretch>
+                      <a:fillRect/>
+                    </a:stretch>
+                  </pic:blipFill>
+                  <pic:spPr>
+                    <a:xfrm>
+                      <a:off x="0" y="0"/>
+                      <a:ext cx="3170195" cy="274344"/>
+                    </a:xfrm>
+                    <a:prstGeom prst="rect">
+                      <a:avLst/>
+                    </a:prstGeom>
+                  </pic:spPr>
+                </pic:pic>
+              </a:graphicData>
+            </a:graphic>
+          </wp:inline>
+        </w:drawing>
+      </w:r>
+    </w:p>
+    <w:p>
+      <w:r>
+        <w:drawing>
+          <wp:inline distT="0" distB="0" distL="0" distR="0" wp14:anchorId="60EDE81B" wp14:editId="21EE2B07">
+            <wp:extent cx="3398815" cy="274344"/>
+            <wp:effectExtent l="0" t="0" r="0" b="0"/>
+            <wp:docPr id="524757745" name="תמונה 1"/>
+            <wp:cNvGraphicFramePr>
+              <a:graphicFrameLocks xmlns:a="http://schemas.openxmlformats.org/drawingml/2006/main" noChangeAspect="1"/>
+            </wp:cNvGraphicFramePr>
+            <a:graphic xmlns:a="http://schemas.openxmlformats.org/drawingml/2006/main">
+              <a:graphicData uri="http://schemas.openxmlformats.org/drawingml/2006/picture">
+                <pic:pic xmlns:pic="http://schemas.openxmlformats.org/drawingml/2006/picture">
+                  <pic:nvPicPr>
+                    <pic:cNvPr id="524757745" name=""/>
+                    <pic:cNvPicPr/>
+                  </pic:nvPicPr>
+                  <pic:blipFill>
+                    <a:blip r:embed="rId27"/>
+                    <a:stretch>
+                      <a:fillRect/>
+                    </a:stretch>
+                  </pic:blipFill>
+                  <pic:spPr>
+                    <a:xfrm>
+                      <a:off x="0" y="0"/>
+                      <a:ext cx="3398815" cy="274344"/>
                     </a:xfrm>
                     <a:prstGeom prst="rect">
                       <a:avLst/>
@@ -1272,6 +2415,61 @@
       <w:spacing w:val="5"/>
     </w:rPr>
   </w:style>
+  <w:style w:type="paragraph" w:styleId="ae">
+    <w:name w:val="caption"/>
+    <w:basedOn w:val="a"/>
+    <w:next w:val="a"/>
+    <w:uiPriority w:val="35"/>
+    <w:semiHidden/>
+    <w:unhideWhenUsed/>
+    <w:qFormat/>
+    <w:rsid w:val="00244962"/>
+    <w:pPr>
+      <w:spacing w:after="200" w:line="240" w:lineRule="auto"/>
+    </w:pPr>
+    <w:rPr>
+      <w:i/>
+      <w:iCs/>
+      <w:color w:val="0E2841" w:themeColor="text2"/>
+      <w:sz w:val="18"/>
+      <w:szCs w:val="18"/>
+    </w:rPr>
+  </w:style>
+  <w:style w:type="character" w:styleId="Hyperlink">
+    <w:name w:val="Hyperlink"/>
+    <w:basedOn w:val="a0"/>
+    <w:uiPriority w:val="99"/>
+    <w:unhideWhenUsed/>
+    <w:rsid w:val="0037315B"/>
+    <w:rPr>
+      <w:color w:val="467886" w:themeColor="hyperlink"/>
+      <w:u w:val="single"/>
+    </w:rPr>
+  </w:style>
+  <w:style w:type="character" w:styleId="af">
+    <w:name w:val="Unresolved Mention"/>
+    <w:basedOn w:val="a0"/>
+    <w:uiPriority w:val="99"/>
+    <w:semiHidden/>
+    <w:unhideWhenUsed/>
+    <w:rsid w:val="0037315B"/>
+    <w:rPr>
+      <w:color w:val="605E5C"/>
+      <w:shd w:val="clear" w:color="auto" w:fill="E1DFDD"/>
+    </w:rPr>
+  </w:style>
+  <w:style w:type="character" w:styleId="FollowedHyperlink">
+    <w:name w:val="FollowedHyperlink"/>
+    <w:basedOn w:val="a0"/>
+    <w:uiPriority w:val="99"/>
+    <w:semiHidden/>
+    <w:unhideWhenUsed/>
+    <w:rsid w:val="0037315B"/>
+    <w:rPr>
+      <w:color w:val="96607D" w:themeColor="followedHyperlink"/>
+      <w:u w:val="single"/>
+    </w:rPr>
+  </w:style>
 </w:styles>
 </file>
 

</xml_diff>